<commit_message>
Homeworks + vignettes: descriptive names, auto-index, vignette R-script downloads
</commit_message>
<xml_diff>
--- a/docs/homeworks/index.docx
+++ b/docs/homeworks/index.docx
@@ -12,10 +12,114 @@
     </w:p>
     <w:p>
       <w:pPr>
+        <w:pStyle w:val="Author"/>
+      </w:pPr>
+      <w:r>
+        <w:t xml:space="preserve">Bill Perry</w:t>
+      </w:r>
+    </w:p>
+    <w:p>
+      <w:pPr>
         <w:pStyle w:val="FirstParagraph"/>
       </w:pPr>
       <w:r>
-        <w:t xml:space="preserve">Homework assignments are posted here. Click on an assignment to view the details, due dates, and submission instructions.</w:t>
+        <w:t xml:space="preserve">Homework assignments are posted here, pulled straight from each file’s YAML</w:t>
+      </w:r>
+      <w:r>
+        <w:t xml:space="preserve"> </w:t>
+      </w:r>
+      <w:r>
+        <w:t xml:space="preserve">frontmatter (</w:t>
+      </w:r>
+      <w:r>
+        <w:rPr>
+          <w:rStyle w:val="VerbatimChar"/>
+        </w:rPr>
+        <w:t xml:space="preserve">order:</w:t>
+      </w:r>
+      <w:r>
+        <w:t xml:space="preserve">,</w:t>
+      </w:r>
+      <w:r>
+        <w:t xml:space="preserve"> </w:t>
+      </w:r>
+      <w:r>
+        <w:rPr>
+          <w:rStyle w:val="VerbatimChar"/>
+        </w:rPr>
+        <w:t xml:space="preserve">week:</w:t>
+      </w:r>
+      <w:r>
+        <w:t xml:space="preserve">,</w:t>
+      </w:r>
+      <w:r>
+        <w:t xml:space="preserve"> </w:t>
+      </w:r>
+      <w:r>
+        <w:rPr>
+          <w:rStyle w:val="VerbatimChar"/>
+        </w:rPr>
+        <w:t xml:space="preserve">description:</w:t>
+      </w:r>
+      <w:r>
+        <w:t xml:space="preserve">) — nothing on this page is</w:t>
+      </w:r>
+      <w:r>
+        <w:t xml:space="preserve"> </w:t>
+      </w:r>
+      <w:r>
+        <w:t xml:space="preserve">hand-typed. Ordering comes from the</w:t>
+      </w:r>
+      <w:r>
+        <w:t xml:space="preserve"> </w:t>
+      </w:r>
+      <w:r>
+        <w:rPr>
+          <w:rStyle w:val="VerbatimChar"/>
+        </w:rPr>
+        <w:t xml:space="preserve">order:</w:t>
+      </w:r>
+      <w:r>
+        <w:t xml:space="preserve"> </w:t>
+      </w:r>
+      <w:r>
+        <w:t xml:space="preserve">field, filled in automatically by</w:t>
+      </w:r>
+      <w:r>
+        <w:t xml:space="preserve"> </w:t>
+      </w:r>
+      <w:r>
+        <w:t xml:space="preserve">the</w:t>
+      </w:r>
+      <w:r>
+        <w:t xml:space="preserve"> </w:t>
+      </w:r>
+      <w:r>
+        <w:rPr>
+          <w:rStyle w:val="VerbatimChar"/>
+        </w:rPr>
+        <w:t xml:space="preserve">sync_order_from_folder_names.R</w:t>
+      </w:r>
+      <w:r>
+        <w:t xml:space="preserve"> </w:t>
+      </w:r>
+      <w:r>
+        <w:t xml:space="preserve">pre-render hook from each folder’s</w:t>
+      </w:r>
+      <w:r>
+        <w:t xml:space="preserve"> </w:t>
+      </w:r>
+      <w:r>
+        <w:rPr>
+          <w:rStyle w:val="VerbatimChar"/>
+        </w:rPr>
+        <w:t xml:space="preserve">WW_MM_</w:t>
+      </w:r>
+      <w:r>
+        <w:t xml:space="preserve"> </w:t>
+      </w:r>
+      <w:r>
+        <w:t xml:space="preserve">number prefix. Click one to view the details, due dates, and submission instructions.</w:t>
       </w:r>
     </w:p>
     <w:sectPr>

</xml_diff>